<commit_message>
feat: add receipt cut lines
</commit_message>
<xml_diff>
--- a/src/XlsxDocxGenerator/Assets/Templates/receipt-template.docx
+++ b/src/XlsxDocxGenerator/Assets/Templates/receipt-template.docx
@@ -1311,23 +1311,23 @@
               <wp:anchor allowOverlap="1" behindDoc="0" distB="0" distT="0" distL="114300" distR="114300" hidden="0" layoutInCell="1" locked="0" relativeHeight="0" simplePos="0">
                 <wp:simplePos x="0" y="0"/>
                 <wp:positionH relativeFrom="column">
-                  <wp:posOffset>2</wp:posOffset>
+                  <wp:posOffset>0</wp:posOffset>
                 </wp:positionH>
                 <wp:positionV relativeFrom="paragraph">
                   <wp:posOffset>119380</wp:posOffset>
                 </wp:positionV>
-                <wp:extent cx="0" cy="12700"/>
+                <wp:extent cx="6840220" cy="0"/>
                 <wp:effectExtent b="0" l="0" r="0" t="0"/>
                 <wp:wrapNone/>
-                <wp:docPr id="4" name=""/>
+                <wp:docPr id="4" name="ReceiptCutLine1"/>
                 <a:graphic>
                   <a:graphicData uri="http://schemas.microsoft.com/office/word/2010/wordprocessingShape">
                     <wps:wsp>
                       <wps:cNvCnPr/>
                       <wps:spPr>
                         <a:xfrm>
-                          <a:off x="2145600" y="3780000"/>
-                          <a:ext cx="6400800" cy="0"/>
+                          <a:off x="0" y="0"/>
+                          <a:ext cx="6840220" cy="0"/>
                         </a:xfrm>
                         <a:prstGeom prst="straightConnector1">
                           <a:avLst/>
@@ -1335,9 +1335,9 @@
                         <a:noFill/>
                         <a:ln cap="flat" cmpd="sng" w="9525">
                           <a:solidFill>
-                            <a:srgbClr val="000000"/>
+                            <a:srgbClr val="808080"/>
                           </a:solidFill>
-                          <a:prstDash val="dot"/>
+                          <a:prstDash val="dash"/>
                           <a:round/>
                           <a:headEnd len="med" w="med" type="none"/>
                           <a:tailEnd len="med" w="med" type="none"/>
@@ -1352,48 +1352,6 @@
               </wp:anchor>
             </w:drawing>
           </mc:Choice>
-          <mc:Fallback>
-            <w:drawing>
-              <wp:anchor allowOverlap="1" behindDoc="0" distB="0" distT="0" distL="114300" distR="114300" hidden="0" layoutInCell="1" locked="0" relativeHeight="0" simplePos="0">
-                <wp:simplePos x="0" y="0"/>
-                <wp:positionH relativeFrom="column">
-                  <wp:posOffset>2</wp:posOffset>
-                </wp:positionH>
-                <wp:positionV relativeFrom="paragraph">
-                  <wp:posOffset>119380</wp:posOffset>
-                </wp:positionV>
-                <wp:extent cx="0" cy="12700"/>
-                <wp:effectExtent b="0" l="0" r="0" t="0"/>
-                <wp:wrapNone/>
-                <wp:docPr id="4" name="image2.png"/>
-                <a:graphic>
-                  <a:graphicData uri="http://schemas.openxmlformats.org/drawingml/2006/picture">
-                    <pic:pic>
-                      <pic:nvPicPr>
-                        <pic:cNvPr id="0" name="image2.png"/>
-                        <pic:cNvPicPr preferRelativeResize="0"/>
-                      </pic:nvPicPr>
-                      <pic:blipFill>
-                        <a:blip r:embed="rId7"/>
-                        <a:srcRect/>
-                        <a:stretch>
-                          <a:fillRect/>
-                        </a:stretch>
-                      </pic:blipFill>
-                      <pic:spPr>
-                        <a:xfrm>
-                          <a:off x="0" y="0"/>
-                          <a:ext cx="0" cy="12700"/>
-                        </a:xfrm>
-                        <a:prstGeom prst="rect"/>
-                        <a:ln/>
-                      </pic:spPr>
-                    </pic:pic>
-                  </a:graphicData>
-                </a:graphic>
-              </wp:anchor>
-            </w:drawing>
-          </mc:Fallback>
         </mc:AlternateContent>
       </w:r>
     </w:p>
@@ -2719,23 +2677,23 @@
               <wp:anchor allowOverlap="1" behindDoc="0" distB="0" distT="0" distL="114300" distR="114300" hidden="0" layoutInCell="1" locked="0" relativeHeight="0" simplePos="0">
                 <wp:simplePos x="0" y="0"/>
                 <wp:positionH relativeFrom="column">
-                  <wp:posOffset>2</wp:posOffset>
+                  <wp:posOffset>0</wp:posOffset>
                 </wp:positionH>
                 <wp:positionV relativeFrom="paragraph">
                   <wp:posOffset>274955</wp:posOffset>
                 </wp:positionV>
-                <wp:extent cx="0" cy="12700"/>
+                <wp:extent cx="6840220" cy="0"/>
                 <wp:effectExtent b="0" l="0" r="0" t="0"/>
                 <wp:wrapNone/>
-                <wp:docPr id="3" name=""/>
+                <wp:docPr id="3" name="ReceiptCutLine2"/>
                 <a:graphic>
                   <a:graphicData uri="http://schemas.microsoft.com/office/word/2010/wordprocessingShape">
                     <wps:wsp>
                       <wps:cNvCnPr/>
                       <wps:spPr>
                         <a:xfrm>
-                          <a:off x="2145600" y="3780000"/>
-                          <a:ext cx="6400800" cy="0"/>
+                          <a:off x="0" y="0"/>
+                          <a:ext cx="6840220" cy="0"/>
                         </a:xfrm>
                         <a:prstGeom prst="straightConnector1">
                           <a:avLst/>
@@ -2743,9 +2701,9 @@
                         <a:noFill/>
                         <a:ln cap="flat" cmpd="sng" w="9525">
                           <a:solidFill>
-                            <a:srgbClr val="000000"/>
+                            <a:srgbClr val="808080"/>
                           </a:solidFill>
-                          <a:prstDash val="dot"/>
+                          <a:prstDash val="dash"/>
                           <a:round/>
                           <a:headEnd len="med" w="med" type="none"/>
                           <a:tailEnd len="med" w="med" type="none"/>
@@ -2760,48 +2718,6 @@
               </wp:anchor>
             </w:drawing>
           </mc:Choice>
-          <mc:Fallback>
-            <w:drawing>
-              <wp:anchor allowOverlap="1" behindDoc="0" distB="0" distT="0" distL="114300" distR="114300" hidden="0" layoutInCell="1" locked="0" relativeHeight="0" simplePos="0">
-                <wp:simplePos x="0" y="0"/>
-                <wp:positionH relativeFrom="column">
-                  <wp:posOffset>2</wp:posOffset>
-                </wp:positionH>
-                <wp:positionV relativeFrom="paragraph">
-                  <wp:posOffset>274955</wp:posOffset>
-                </wp:positionV>
-                <wp:extent cx="0" cy="12700"/>
-                <wp:effectExtent b="0" l="0" r="0" t="0"/>
-                <wp:wrapNone/>
-                <wp:docPr id="3" name="image1.png"/>
-                <a:graphic>
-                  <a:graphicData uri="http://schemas.openxmlformats.org/drawingml/2006/picture">
-                    <pic:pic>
-                      <pic:nvPicPr>
-                        <pic:cNvPr id="0" name="image1.png"/>
-                        <pic:cNvPicPr preferRelativeResize="0"/>
-                      </pic:nvPicPr>
-                      <pic:blipFill>
-                        <a:blip r:embed="rId7"/>
-                        <a:srcRect/>
-                        <a:stretch>
-                          <a:fillRect/>
-                        </a:stretch>
-                      </pic:blipFill>
-                      <pic:spPr>
-                        <a:xfrm>
-                          <a:off x="0" y="0"/>
-                          <a:ext cx="0" cy="12700"/>
-                        </a:xfrm>
-                        <a:prstGeom prst="rect"/>
-                        <a:ln/>
-                      </pic:spPr>
-                    </pic:pic>
-                  </a:graphicData>
-                </a:graphic>
-              </wp:anchor>
-            </w:drawing>
-          </mc:Fallback>
         </mc:AlternateContent>
       </w:r>
     </w:p>

</xml_diff>